<commit_message>
08: especificación sin control por tamaño (principal, contraste contdid y placebo 2018), consistente con 01-05
Co-Authored-By: Claude Sonnet 5 <noreply@anthropic.com>
</commit_message>
<xml_diff>
--- a/4. RESULTADOS/08_tratamiento_continuo/T17_efecto_por_quintil.docx
+++ b/4. RESULTADOS/08_tratamiento_continuo/T17_efecto_por_quintil.docx
@@ -711,7 +711,7 @@
                 <w:szCs w:val="22"/>
                 <w:color w:val="000000"/>
               </w:rPr>
-              <w:t xml:space="preserve">0.0078</w:t>
+              <w:t xml:space="preserve">0.0097</w:t>
             </w:r>
           </w:p>
         </w:tc>
@@ -766,7 +766,7 @@
                 <w:szCs w:val="22"/>
                 <w:color w:val="000000"/>
               </w:rPr>
-              <w:t xml:space="preserve">0.0105</w:t>
+              <w:t xml:space="preserve">0.0103</w:t>
             </w:r>
           </w:p>
         </w:tc>
@@ -821,7 +821,7 @@
                 <w:szCs w:val="22"/>
                 <w:color w:val="000000"/>
               </w:rPr>
-              <w:t xml:space="preserve">0.4560</w:t>
+              <w:t xml:space="preserve">0.3496</w:t>
             </w:r>
           </w:p>
         </w:tc>
@@ -931,7 +931,7 @@
                 <w:szCs w:val="22"/>
                 <w:color w:val="000000"/>
               </w:rPr>
-              <w:t xml:space="preserve">-0.0127</w:t>
+              <w:t xml:space="preserve">-0.0106</w:t>
             </w:r>
           </w:p>
         </w:tc>
@@ -986,7 +986,7 @@
                 <w:szCs w:val="22"/>
                 <w:color w:val="000000"/>
               </w:rPr>
-              <w:t xml:space="preserve">0.0284</w:t>
+              <w:t xml:space="preserve">0.0299</w:t>
             </w:r>
           </w:p>
         </w:tc>
@@ -1041,7 +1041,7 @@
                 <w:szCs w:val="22"/>
                 <w:color w:val="000000"/>
               </w:rPr>
-              <w:t xml:space="preserve">0.7824</w:t>
+              <w:t xml:space="preserve">0.9667</w:t>
             </w:r>
           </w:p>
         </w:tc>
@@ -1211,7 +1211,7 @@
                 <w:szCs w:val="22"/>
                 <w:color w:val="000000"/>
               </w:rPr>
-              <w:t xml:space="preserve">0.0002</w:t>
+              <w:t xml:space="preserve">0.0037</w:t>
             </w:r>
           </w:p>
         </w:tc>
@@ -1266,7 +1266,7 @@
                 <w:szCs w:val="22"/>
                 <w:color w:val="000000"/>
               </w:rPr>
-              <w:t xml:space="preserve">0.0112</w:t>
+              <w:t xml:space="preserve">0.0107</w:t>
             </w:r>
           </w:p>
         </w:tc>
@@ -1321,7 +1321,7 @@
                 <w:szCs w:val="22"/>
                 <w:color w:val="000000"/>
               </w:rPr>
-              <w:t xml:space="preserve">0.9887</w:t>
+              <w:t xml:space="preserve">0.7290</w:t>
             </w:r>
           </w:p>
         </w:tc>
@@ -1431,7 +1431,7 @@
                 <w:szCs w:val="22"/>
                 <w:color w:val="000000"/>
               </w:rPr>
-              <w:t xml:space="preserve">-0.0219</w:t>
+              <w:t xml:space="preserve">-0.0173</w:t>
             </w:r>
           </w:p>
         </w:tc>
@@ -1486,7 +1486,7 @@
                 <w:szCs w:val="22"/>
                 <w:color w:val="000000"/>
               </w:rPr>
-              <w:t xml:space="preserve">0.0222</w:t>
+              <w:t xml:space="preserve">0.0248</w:t>
             </w:r>
           </w:p>
         </w:tc>
@@ -1541,7 +1541,7 @@
                 <w:szCs w:val="22"/>
                 <w:color w:val="000000"/>
               </w:rPr>
-              <w:t xml:space="preserve">0.0159</w:t>
+              <w:t xml:space="preserve">0.3721</w:t>
             </w:r>
           </w:p>
         </w:tc>
@@ -1711,7 +1711,7 @@
                 <w:szCs w:val="22"/>
                 <w:color w:val="000000"/>
               </w:rPr>
-              <w:t xml:space="preserve">-0.0257</w:t>
+              <w:t xml:space="preserve">-0.0216</w:t>
             </w:r>
           </w:p>
         </w:tc>
@@ -1766,7 +1766,7 @@
                 <w:szCs w:val="22"/>
                 <w:color w:val="000000"/>
               </w:rPr>
-              <w:t xml:space="preserve">0.0114</w:t>
+              <w:t xml:space="preserve">0.0106</w:t>
             </w:r>
           </w:p>
         </w:tc>
@@ -1821,7 +1821,7 @@
                 <w:szCs w:val="22"/>
                 <w:color w:val="000000"/>
               </w:rPr>
-              <w:t xml:space="preserve">0.0242</w:t>
+              <w:t xml:space="preserve">0.0425</w:t>
             </w:r>
           </w:p>
         </w:tc>
@@ -1931,7 +1931,7 @@
                 <w:szCs w:val="22"/>
                 <w:color w:val="000000"/>
               </w:rPr>
-              <w:t xml:space="preserve">-0.0481</w:t>
+              <w:t xml:space="preserve">-0.0424</w:t>
             </w:r>
           </w:p>
         </w:tc>
@@ -1986,7 +1986,7 @@
                 <w:szCs w:val="22"/>
                 <w:color w:val="000000"/>
               </w:rPr>
-              <w:t xml:space="preserve">-0.0034</w:t>
+              <w:t xml:space="preserve">-0.0007</w:t>
             </w:r>
           </w:p>
         </w:tc>
@@ -2041,7 +2041,7 @@
                 <w:szCs w:val="22"/>
                 <w:color w:val="000000"/>
               </w:rPr>
-              <w:t xml:space="preserve">-2.5727</w:t>
+              <w:t xml:space="preserve">-2.1571</w:t>
             </w:r>
           </w:p>
         </w:tc>
@@ -2211,7 +2211,7 @@
                 <w:szCs w:val="22"/>
                 <w:color w:val="000000"/>
               </w:rPr>
-              <w:t xml:space="preserve">-0.0251</w:t>
+              <w:t xml:space="preserve">-0.0204</w:t>
             </w:r>
           </w:p>
         </w:tc>
@@ -2266,7 +2266,7 @@
                 <w:szCs w:val="22"/>
                 <w:color w:val="000000"/>
               </w:rPr>
-              <w:t xml:space="preserve">0.0120</w:t>
+              <w:t xml:space="preserve">0.0110</w:t>
             </w:r>
           </w:p>
         </w:tc>
@@ -2321,7 +2321,7 @@
                 <w:szCs w:val="22"/>
                 <w:color w:val="000000"/>
               </w:rPr>
-              <w:t xml:space="preserve">0.0373</w:t>
+              <w:t xml:space="preserve">0.0642</w:t>
             </w:r>
           </w:p>
         </w:tc>
@@ -2376,7 +2376,7 @@
                 <w:szCs w:val="22"/>
                 <w:color w:val="000000"/>
               </w:rPr>
-              <w:t xml:space="preserve">**</w:t>
+              <w:t xml:space="preserve">*</w:t>
             </w:r>
           </w:p>
         </w:tc>
@@ -2431,7 +2431,7 @@
                 <w:szCs w:val="22"/>
                 <w:color w:val="000000"/>
               </w:rPr>
-              <w:t xml:space="preserve">-0.0487</w:t>
+              <w:t xml:space="preserve">-0.0420</w:t>
             </w:r>
           </w:p>
         </w:tc>
@@ -2486,7 +2486,7 @@
                 <w:szCs w:val="22"/>
                 <w:color w:val="000000"/>
               </w:rPr>
-              <w:t xml:space="preserve">-0.0015</w:t>
+              <w:t xml:space="preserve">0.0012</w:t>
             </w:r>
           </w:p>
         </w:tc>
@@ -2541,7 +2541,7 @@
                 <w:szCs w:val="22"/>
                 <w:color w:val="000000"/>
               </w:rPr>
-              <w:t xml:space="preserve">-2.5089</w:t>
+              <w:t xml:space="preserve">-2.0378</w:t>
             </w:r>
           </w:p>
         </w:tc>
@@ -2711,7 +2711,7 @@
                 <w:szCs w:val="22"/>
                 <w:color w:val="000000"/>
               </w:rPr>
-              <w:t xml:space="preserve">-0.0056</w:t>
+              <w:t xml:space="preserve">-0.0320</w:t>
             </w:r>
           </w:p>
         </w:tc>
@@ -2766,7 +2766,7 @@
                 <w:szCs w:val="22"/>
                 <w:color w:val="000000"/>
               </w:rPr>
-              <w:t xml:space="preserve">0.0192</w:t>
+              <w:t xml:space="preserve">0.0194</w:t>
             </w:r>
           </w:p>
         </w:tc>
@@ -2821,7 +2821,7 @@
                 <w:szCs w:val="22"/>
                 <w:color w:val="000000"/>
               </w:rPr>
-              <w:t xml:space="preserve">0.7695</w:t>
+              <w:t xml:space="preserve">0.0995</w:t>
             </w:r>
           </w:p>
         </w:tc>
@@ -2876,7 +2876,7 @@
                 <w:szCs w:val="22"/>
                 <w:color w:val="000000"/>
               </w:rPr>
-              <w:t xml:space="preserve"/>
+              <w:t xml:space="preserve">*</w:t>
             </w:r>
           </w:p>
         </w:tc>
@@ -2931,7 +2931,7 @@
                 <w:szCs w:val="22"/>
                 <w:color w:val="000000"/>
               </w:rPr>
-              <w:t xml:space="preserve">-0.0433</w:t>
+              <w:t xml:space="preserve">-0.0700</w:t>
             </w:r>
           </w:p>
         </w:tc>
@@ -2986,7 +2986,7 @@
                 <w:szCs w:val="22"/>
                 <w:color w:val="000000"/>
               </w:rPr>
-              <w:t xml:space="preserve">0.0321</w:t>
+              <w:t xml:space="preserve">0.0061</w:t>
             </w:r>
           </w:p>
         </w:tc>
@@ -3041,7 +3041,7 @@
                 <w:szCs w:val="22"/>
                 <w:color w:val="000000"/>
               </w:rPr>
-              <w:t xml:space="preserve">-0.5638</w:t>
+              <w:t xml:space="preserve">-3.1953</w:t>
             </w:r>
           </w:p>
         </w:tc>
@@ -3211,7 +3211,7 @@
                 <w:szCs w:val="22"/>
                 <w:color w:val="000000"/>
               </w:rPr>
-              <w:t xml:space="preserve">0.0046</w:t>
+              <w:t xml:space="preserve">-0.0501</w:t>
             </w:r>
           </w:p>
         </w:tc>
@@ -3266,7 +3266,7 @@
                 <w:szCs w:val="22"/>
                 <w:color w:val="000000"/>
               </w:rPr>
-              <w:t xml:space="preserve">0.0208</w:t>
+              <w:t xml:space="preserve">0.0201</w:t>
             </w:r>
           </w:p>
         </w:tc>
@@ -3321,7 +3321,7 @@
                 <w:szCs w:val="22"/>
                 <w:color w:val="000000"/>
               </w:rPr>
-              <w:t xml:space="preserve">0.8245</w:t>
+              <w:t xml:space="preserve">0.0127</w:t>
             </w:r>
           </w:p>
         </w:tc>
@@ -3376,7 +3376,7 @@
                 <w:szCs w:val="22"/>
                 <w:color w:val="000000"/>
               </w:rPr>
-              <w:t xml:space="preserve"/>
+              <w:t xml:space="preserve">**</w:t>
             </w:r>
           </w:p>
         </w:tc>
@@ -3431,7 +3431,7 @@
                 <w:szCs w:val="22"/>
                 <w:color w:val="000000"/>
               </w:rPr>
-              <w:t xml:space="preserve">-0.0361</w:t>
+              <w:t xml:space="preserve">-0.0895</w:t>
             </w:r>
           </w:p>
         </w:tc>
@@ -3486,7 +3486,7 @@
                 <w:szCs w:val="22"/>
                 <w:color w:val="000000"/>
               </w:rPr>
-              <w:t xml:space="preserve">0.0453</w:t>
+              <w:t xml:space="preserve">-0.0107</w:t>
             </w:r>
           </w:p>
         </w:tc>
@@ -3541,7 +3541,7 @@
                 <w:szCs w:val="22"/>
                 <w:color w:val="000000"/>
               </w:rPr>
-              <w:t xml:space="preserve">0.4603</w:t>
+              <w:t xml:space="preserve">-5.0131</w:t>
             </w:r>
           </w:p>
         </w:tc>
@@ -3711,7 +3711,7 @@
                 <w:szCs w:val="22"/>
                 <w:color w:val="000000"/>
               </w:rPr>
-              <w:t xml:space="preserve">-0.0278</w:t>
+              <w:t xml:space="preserve">-0.1020</w:t>
             </w:r>
           </w:p>
         </w:tc>
@@ -3766,7 +3766,7 @@
                 <w:szCs w:val="22"/>
                 <w:color w:val="000000"/>
               </w:rPr>
-              <w:t xml:space="preserve">0.0217</w:t>
+              <w:t xml:space="preserve">0.0209</w:t>
             </w:r>
           </w:p>
         </w:tc>
@@ -3821,7 +3821,7 @@
                 <w:szCs w:val="22"/>
                 <w:color w:val="000000"/>
               </w:rPr>
-              <w:t xml:space="preserve">0.2006</w:t>
+              <w:t xml:space="preserve">0.0000</w:t>
             </w:r>
           </w:p>
         </w:tc>
@@ -3876,7 +3876,7 @@
                 <w:szCs w:val="22"/>
                 <w:color w:val="000000"/>
               </w:rPr>
-              <w:t xml:space="preserve"/>
+              <w:t xml:space="preserve">***</w:t>
             </w:r>
           </w:p>
         </w:tc>
@@ -3931,7 +3931,7 @@
                 <w:szCs w:val="22"/>
                 <w:color w:val="000000"/>
               </w:rPr>
-              <w:t xml:space="preserve">-0.0703</w:t>
+              <w:t xml:space="preserve">-0.1429</w:t>
             </w:r>
           </w:p>
         </w:tc>
@@ -3986,7 +3986,7 @@
                 <w:szCs w:val="22"/>
                 <w:color w:val="000000"/>
               </w:rPr>
-              <w:t xml:space="preserve">0.0148</w:t>
+              <w:t xml:space="preserve">-0.0611</w:t>
             </w:r>
           </w:p>
         </w:tc>
@@ -4041,7 +4041,7 @@
                 <w:szCs w:val="22"/>
                 <w:color w:val="000000"/>
               </w:rPr>
-              <w:t xml:space="preserve">-2.7765</w:t>
+              <w:t xml:space="preserve">-10.1983</w:t>
             </w:r>
           </w:p>
         </w:tc>
@@ -4211,7 +4211,7 @@
                 <w:szCs w:val="22"/>
                 <w:color w:val="000000"/>
               </w:rPr>
-              <w:t xml:space="preserve">-0.0263</w:t>
+              <w:t xml:space="preserve">-0.1220</w:t>
             </w:r>
           </w:p>
         </w:tc>
@@ -4266,7 +4266,7 @@
                 <w:szCs w:val="22"/>
                 <w:color w:val="000000"/>
               </w:rPr>
-              <w:t xml:space="preserve">0.0221</w:t>
+              <w:t xml:space="preserve">0.0211</w:t>
             </w:r>
           </w:p>
         </w:tc>
@@ -4321,7 +4321,7 @@
                 <w:szCs w:val="22"/>
                 <w:color w:val="000000"/>
               </w:rPr>
-              <w:t xml:space="preserve">0.2343</w:t>
+              <w:t xml:space="preserve">0.0000</w:t>
             </w:r>
           </w:p>
         </w:tc>
@@ -4376,7 +4376,7 @@
                 <w:szCs w:val="22"/>
                 <w:color w:val="000000"/>
               </w:rPr>
-              <w:t xml:space="preserve"/>
+              <w:t xml:space="preserve">***</w:t>
             </w:r>
           </w:p>
         </w:tc>
@@ -4431,7 +4431,7 @@
                 <w:szCs w:val="22"/>
                 <w:color w:val="000000"/>
               </w:rPr>
-              <w:t xml:space="preserve">-0.0696</w:t>
+              <w:t xml:space="preserve">-0.1634</w:t>
             </w:r>
           </w:p>
         </w:tc>
@@ -4486,7 +4486,7 @@
                 <w:szCs w:val="22"/>
                 <w:color w:val="000000"/>
               </w:rPr>
-              <w:t xml:space="preserve">0.0170</w:t>
+              <w:t xml:space="preserve">-0.0806</w:t>
             </w:r>
           </w:p>
         </w:tc>
@@ -4541,7 +4541,7 @@
                 <w:szCs w:val="22"/>
                 <w:color w:val="000000"/>
               </w:rPr>
-              <w:t xml:space="preserve">-2.6292</w:t>
+              <w:t xml:space="preserve">-12.2039</w:t>
             </w:r>
           </w:p>
         </w:tc>

</xml_diff>